<commit_message>
Update technical report with NVIDIA NIM Llama-3.1 API configurations, github links, embedded screenshots, and PDF version
</commit_message>
<xml_diff>
--- a/AI_Assistant_Technical_Report.docx
+++ b/AI_Assistant_Technical_Report.docx
@@ -29,7 +29,9 @@
         </w:rPr>
         <w:t>Complete Technical Report &amp; Project Documentation</w:t>
         <w:br/>
-        <w:t>Major Project: Prompt Engineering | Powered by Llama-3.1 NIM API</w:t>
+        <w:t>GitHub Repository: https://github.com/abhinavsai2006/Syntactic-Intelligence.git</w:t>
+        <w:br/>
+        <w:t>Major Project: Prompt Engineering | Powered by NVIDIA NIM Llama-3.1-8B-Instruct API</w:t>
       </w:r>
     </w:p>
     <w:p>
@@ -127,7 +129,7 @@
           <w:color w:val="4F46E5"/>
           <w:sz w:val="36"/>
         </w:rPr>
-        <w:t>2. System Architecture &amp; Component Design</w:t>
+        <w:t>2. Technical Stack &amp; Component Design</w:t>
       </w:r>
     </w:p>
     <w:p>
@@ -155,12 +157,13 @@
           <w:color w:val="0F172A"/>
           <w:sz w:val="28"/>
         </w:rPr>
-        <w:t>2.1 Backend Pipeline (Flask &amp; NVIDIA NIM API)</w:t>
+        <w:t>2.1 Frontend Architecture</w:t>
       </w:r>
     </w:p>
     <w:p>
       <w:pPr>
-        <w:spacing w:after="160" w:line="276" w:lineRule="auto"/>
+        <w:pStyle w:val="ListBullet"/>
+        <w:spacing w:after="80" w:line="276" w:lineRule="auto"/>
       </w:pPr>
       <w:r>
         <w:rPr>
@@ -168,7 +171,35 @@
           <w:color w:val="334155"/>
           <w:sz w:val="22"/>
         </w:rPr>
-        <w:t>The app server (app.py) leverages the requests client to connect directly with the NVIDIA NIM chat completion endpoint. Environment variables (.env) isolate sensitive API credentials. The backend maintains nine prompt templates mapped to selectable dropdown values.</w:t>
+        <w:t>Tailwind CSS CDN Integration: Used to configure responsive columns, utility inputs, and flat border cards.</w:t>
+      </w:r>
+    </w:p>
+    <w:p>
+      <w:pPr>
+        <w:pStyle w:val="ListBullet"/>
+        <w:spacing w:after="80" w:line="276" w:lineRule="auto"/>
+      </w:pPr>
+      <w:r>
+        <w:rPr>
+          <w:rFonts w:ascii="Calibri" w:hAnsi="Calibri"/>
+          <w:color w:val="334155"/>
+          <w:sz w:val="22"/>
+        </w:rPr>
+        <w:t>Asynchronous AJAX Client: Utilizes standard browser fetch() calls to submit forms and rate feedbacks without page reloading.</w:t>
+      </w:r>
+    </w:p>
+    <w:p>
+      <w:pPr>
+        <w:pStyle w:val="ListBullet"/>
+        <w:spacing w:after="80" w:line="276" w:lineRule="auto"/>
+      </w:pPr>
+      <w:r>
+        <w:rPr>
+          <w:rFonts w:ascii="Calibri" w:hAnsi="Calibri"/>
+          <w:color w:val="334155"/>
+          <w:sz w:val="22"/>
+        </w:rPr>
+        <w:t>Light Slate Canvas: Background styled in `#f7f9fb` with `#ffffff` container cards to ensure a sleek developer interface.</w:t>
       </w:r>
     </w:p>
     <w:p>
@@ -183,12 +214,13 @@
           <w:color w:val="0F172A"/>
           <w:sz w:val="28"/>
         </w:rPr>
-        <w:t>2.2 Thread-Safe Feedback Mechanism</w:t>
+        <w:t>2.2 Backend Architecture</w:t>
       </w:r>
     </w:p>
     <w:p>
       <w:pPr>
-        <w:spacing w:after="160" w:line="276" w:lineRule="auto"/>
+        <w:pStyle w:val="ListBullet"/>
+        <w:spacing w:after="80" w:line="276" w:lineRule="auto"/>
       </w:pPr>
       <w:r>
         <w:rPr>
@@ -196,7 +228,35 @@
           <w:color w:val="334155"/>
           <w:sz w:val="22"/>
         </w:rPr>
-        <w:t>A local CSV-based database logger aggregates thumbs up/down user rating inputs. Write operations are guarded by threading.Lock() primitives in app.py to prevent file collision issues in multi-user local configurations.</w:t>
+        <w:t>Flask Framework: Coordinates routing pipelines between the HTML workspace, API calling helpers, and CSV log writers.</w:t>
+      </w:r>
+    </w:p>
+    <w:p>
+      <w:pPr>
+        <w:pStyle w:val="ListBullet"/>
+        <w:spacing w:after="80" w:line="276" w:lineRule="auto"/>
+      </w:pPr>
+      <w:r>
+        <w:rPr>
+          <w:rFonts w:ascii="Calibri" w:hAnsi="Calibri"/>
+          <w:color w:val="334155"/>
+          <w:sz w:val="22"/>
+        </w:rPr>
+        <w:t>NVIDIA NIM API Integration: Interfaces with the meta/llama-3.1-8b-instruct chat completion endpoint.</w:t>
+      </w:r>
+    </w:p>
+    <w:p>
+      <w:pPr>
+        <w:pStyle w:val="ListBullet"/>
+        <w:spacing w:after="80" w:line="276" w:lineRule="auto"/>
+      </w:pPr>
+      <w:r>
+        <w:rPr>
+          <w:rFonts w:ascii="Calibri" w:hAnsi="Calibri"/>
+          <w:color w:val="334155"/>
+          <w:sz w:val="22"/>
+        </w:rPr>
+        <w:t>Locking Logging System: Utilizes threading.Lock() primitives to write logs safely to feedback_log.csv.</w:t>
       </w:r>
     </w:p>
     <w:p>
@@ -211,7 +271,20 @@
           <w:color w:val="4F46E5"/>
           <w:sz w:val="36"/>
         </w:rPr>
-        <w:t>3. Source Code Documentation</w:t>
+        <w:t>3. Application Working &amp; Interface Mockups</w:t>
+      </w:r>
+    </w:p>
+    <w:p>
+      <w:pPr>
+        <w:spacing w:after="160" w:line="276" w:lineRule="auto"/>
+      </w:pPr>
+      <w:r>
+        <w:rPr>
+          <w:rFonts w:ascii="Calibri" w:hAnsi="Calibri"/>
+          <w:color w:val="334155"/>
+          <w:sz w:val="22"/>
+        </w:rPr>
+        <w:t>Here are the live screenshots capturing the assistant's workflow and response logs:</w:t>
       </w:r>
     </w:p>
     <w:p>
@@ -226,7 +299,7 @@
           <w:color w:val="0F172A"/>
           <w:sz w:val="28"/>
         </w:rPr>
-        <w:t>3.1 Backend Application (app.py)</w:t>
+        <w:t>3.1 Q&amp;A Response Interface</w:t>
       </w:r>
     </w:p>
     <w:p>
@@ -239,7 +312,175 @@
           <w:color w:val="334155"/>
           <w:sz w:val="22"/>
         </w:rPr>
-        <w:t>The primary Flask logic mapping routers, prompts, and Llama API configurations:</w:t>
+        <w:t>The screen below showcases a user asking 'what is ai' under the Q&amp;A layout. The prompt variation chosen is 'Bullet-Point Facts':</w:t>
+      </w:r>
+    </w:p>
+    <w:p>
+      <w:pPr>
+        <w:spacing w:before="240" w:after="80"/>
+        <w:jc w:val="center"/>
+      </w:pPr>
+      <w:r>
+        <w:drawing>
+          <wp:inline xmlns:a="http://schemas.openxmlformats.org/drawingml/2006/main" xmlns:pic="http://schemas.openxmlformats.org/drawingml/2006/picture">
+            <wp:extent cx="5486400" cy="3070307"/>
+            <wp:docPr id="1" name="Picture 1"/>
+            <wp:cNvGraphicFramePr>
+              <a:graphicFrameLocks noChangeAspect="1"/>
+            </wp:cNvGraphicFramePr>
+            <a:graphic>
+              <a:graphicData uri="http://schemas.openxmlformats.org/drawingml/2006/picture">
+                <pic:pic>
+                  <pic:nvPicPr>
+                    <pic:cNvPr id="0" name="qa_screen.png"/>
+                    <pic:cNvPicPr/>
+                  </pic:nvPicPr>
+                  <pic:blipFill>
+                    <a:blip r:embed="rId9"/>
+                    <a:stretch>
+                      <a:fillRect/>
+                    </a:stretch>
+                  </pic:blipFill>
+                  <pic:spPr>
+                    <a:xfrm>
+                      <a:off x="0" y="0"/>
+                      <a:ext cx="5486400" cy="3070307"/>
+                    </a:xfrm>
+                    <a:prstGeom prst="rect"/>
+                  </pic:spPr>
+                </pic:pic>
+              </a:graphicData>
+            </a:graphic>
+          </wp:inline>
+        </w:drawing>
+      </w:r>
+    </w:p>
+    <w:p>
+      <w:pPr>
+        <w:spacing w:after="240"/>
+        <w:jc w:val="center"/>
+      </w:pPr>
+      <w:r>
+        <w:rPr>
+          <w:rFonts w:ascii="Calibri" w:hAnsi="Calibri"/>
+          <w:i/>
+          <w:color w:val="64748B"/>
+          <w:sz w:val="19"/>
+        </w:rPr>
+        <w:t>Figure: Llama-3.1-8b NIM rendering structured markdown bullet-points in the flat workspace.</w:t>
+      </w:r>
+    </w:p>
+    <w:p>
+      <w:pPr>
+        <w:keepNext/>
+        <w:spacing w:before="240" w:after="120"/>
+      </w:pPr>
+      <w:r>
+        <w:rPr>
+          <w:rFonts w:ascii="Trebuchet MS" w:hAnsi="Trebuchet MS"/>
+          <w:b/>
+          <w:color w:val="0F172A"/>
+          <w:sz w:val="28"/>
+        </w:rPr>
+        <w:t>3.2 Feedback Summary Dashboard</w:t>
+      </w:r>
+    </w:p>
+    <w:p>
+      <w:pPr>
+        <w:spacing w:after="160" w:line="276" w:lineRule="auto"/>
+      </w:pPr>
+      <w:r>
+        <w:rPr>
+          <w:rFonts w:ascii="Calibri" w:hAnsi="Calibri"/>
+          <w:color w:val="334155"/>
+          <w:sz w:val="22"/>
+        </w:rPr>
+        <w:t>The screen below displays the aggregates page (/feedback-summary) plotting total interactions, helpful metrics, and rating distributions:</w:t>
+      </w:r>
+    </w:p>
+    <w:p>
+      <w:pPr>
+        <w:spacing w:before="240" w:after="80"/>
+        <w:jc w:val="center"/>
+      </w:pPr>
+      <w:r>
+        <w:drawing>
+          <wp:inline xmlns:a="http://schemas.openxmlformats.org/drawingml/2006/main" xmlns:pic="http://schemas.openxmlformats.org/drawingml/2006/picture">
+            <wp:extent cx="5486400" cy="3070307"/>
+            <wp:docPr id="2" name="Picture 2"/>
+            <wp:cNvGraphicFramePr>
+              <a:graphicFrameLocks noChangeAspect="1"/>
+            </wp:cNvGraphicFramePr>
+            <a:graphic>
+              <a:graphicData uri="http://schemas.openxmlformats.org/drawingml/2006/picture">
+                <pic:pic>
+                  <pic:nvPicPr>
+                    <pic:cNvPr id="0" name="analytics_screen.png"/>
+                    <pic:cNvPicPr/>
+                  </pic:nvPicPr>
+                  <pic:blipFill>
+                    <a:blip r:embed="rId10"/>
+                    <a:stretch>
+                      <a:fillRect/>
+                    </a:stretch>
+                  </pic:blipFill>
+                  <pic:spPr>
+                    <a:xfrm>
+                      <a:off x="0" y="0"/>
+                      <a:ext cx="5486400" cy="3070307"/>
+                    </a:xfrm>
+                    <a:prstGeom prst="rect"/>
+                  </pic:spPr>
+                </pic:pic>
+              </a:graphicData>
+            </a:graphic>
+          </wp:inline>
+        </w:drawing>
+      </w:r>
+    </w:p>
+    <w:p>
+      <w:pPr>
+        <w:spacing w:after="240"/>
+        <w:jc w:val="center"/>
+      </w:pPr>
+      <w:r>
+        <w:rPr>
+          <w:rFonts w:ascii="Calibri" w:hAnsi="Calibri"/>
+          <w:i/>
+          <w:color w:val="64748B"/>
+          <w:sz w:val="19"/>
+        </w:rPr>
+        <w:t>Figure: Analytics Dashboard displaying aggregate satisfaction rates and per-prompt breakdowns.</w:t>
+      </w:r>
+    </w:p>
+    <w:p>
+      <w:pPr>
+        <w:keepNext/>
+        <w:spacing w:before="360" w:after="160"/>
+      </w:pPr>
+      <w:r>
+        <w:rPr>
+          <w:rFonts w:ascii="Trebuchet MS" w:hAnsi="Trebuchet MS"/>
+          <w:b/>
+          <w:color w:val="4F46E5"/>
+          <w:sz w:val="36"/>
+        </w:rPr>
+        <w:t>4. Complete Source Code Documentation</w:t>
+      </w:r>
+    </w:p>
+    <w:p>
+      <w:pPr>
+        <w:keepNext/>
+        <w:spacing w:before="240" w:after="120"/>
+      </w:pPr>
+      <w:r>
+        <w:rPr>
+          <w:rFonts w:ascii="Trebuchet MS" w:hAnsi="Trebuchet MS"/>
+          <w:b/>
+          <w:color w:val="0F172A"/>
+          <w:sz w:val="28"/>
+        </w:rPr>
+        <w:t>4.1 Flask Server Routing (app.py)</w:t>
       </w:r>
     </w:p>
     <w:tbl>
@@ -795,20 +1036,7 @@
           <w:color w:val="0F172A"/>
           <w:sz w:val="28"/>
         </w:rPr>
-        <w:t>3.2 Main Frontend Template (templates/index.html)</w:t>
-      </w:r>
-    </w:p>
-    <w:p>
-      <w:pPr>
-        <w:spacing w:after="160" w:line="276" w:lineRule="auto"/>
-      </w:pPr>
-      <w:r>
-        <w:rPr>
-          <w:rFonts w:ascii="Calibri" w:hAnsi="Calibri"/>
-          <w:color w:val="334155"/>
-          <w:sz w:val="22"/>
-        </w:rPr>
-        <w:t>Tailwind-styled main workspace rendering tabs, dynamic prompt structures, and rate submission scripts:</w:t>
+        <w:t>4.2 Main HTML Workspace (templates/index.html)</w:t>
       </w:r>
     </w:p>
     <w:tbl>
@@ -1621,20 +1849,7 @@
           <w:color w:val="0F172A"/>
           <w:sz w:val="28"/>
         </w:rPr>
-        <w:t>3.3 Analytics Summary Page (templates/feedback_summary.html)</w:t>
-      </w:r>
-    </w:p>
-    <w:p>
-      <w:pPr>
-        <w:spacing w:after="160" w:line="276" w:lineRule="auto"/>
-      </w:pPr>
-      <w:r>
-        <w:rPr>
-          <w:rFonts w:ascii="Calibri" w:hAnsi="Calibri"/>
-          <w:color w:val="334155"/>
-          <w:sz w:val="22"/>
-        </w:rPr>
-        <w:t>Aggregation metrics visualizer plotting overall satisfaction and detailed prompt evaluations:</w:t>
+        <w:t>4.3 Analytics HTML template (templates/feedback_summary.html)</w:t>
       </w:r>
     </w:p>
     <w:tbl>
@@ -2004,20 +2219,7 @@
           <w:color w:val="0F172A"/>
           <w:sz w:val="28"/>
         </w:rPr>
-        <w:t>3.4 Project Environment Configuration (.env)</w:t>
-      </w:r>
-    </w:p>
-    <w:p>
-      <w:pPr>
-        <w:spacing w:after="160" w:line="276" w:lineRule="auto"/>
-      </w:pPr>
-      <w:r>
-        <w:rPr>
-          <w:rFonts w:ascii="Calibri" w:hAnsi="Calibri"/>
-          <w:color w:val="334155"/>
-          <w:sz w:val="22"/>
-        </w:rPr>
-        <w:t>Key/URL credential definitions (omitting sensitive keys for git repository pushing):</w:t>
+        <w:t>4.4 Setup Requirements (requirements.txt)</w:t>
       </w:r>
     </w:p>
     <w:tbl>
@@ -2046,11 +2248,75 @@
                 <w:color w:val="0F172A"/>
                 <w:sz w:val="18"/>
               </w:rPr>
-              <w:t>NVIDIA_API_KEY=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</w:t>
-              <w:br/>
-              <w:t>NVIDIA_BASE_URL=https://integrate.api.nvidia.com/v1</w:t>
-              <w:br/>
-              <w:t>NVIDIA_LLM_MODEL=meta/llama-3.1-8b-instruct</w:t>
+              <w:t>flask</w:t>
+              <w:br/>
+              <w:t>requests</w:t>
+              <w:br/>
+              <w:t>python-dotenv</w:t>
+              <w:br/>
+              <w:br/>
+            </w:r>
+          </w:p>
+        </w:tc>
+      </w:tr>
+    </w:tbl>
+    <w:p>
+      <w:pPr>
+        <w:keepNext/>
+        <w:spacing w:before="240" w:after="120"/>
+      </w:pPr>
+      <w:r>
+        <w:rPr>
+          <w:rFonts w:ascii="Trebuchet MS" w:hAnsi="Trebuchet MS"/>
+          <w:b/>
+          <w:color w:val="0F172A"/>
+          <w:sz w:val="28"/>
+        </w:rPr>
+        <w:t>4.5 Git Exclusions (.gitignore)</w:t>
+      </w:r>
+    </w:p>
+    <w:tbl>
+      <w:tblPr>
+        <w:tblW w:type="auto" w:w="0"/>
+        <w:tblLayout w:type="fixed"/>
+        <w:tblLook w:firstColumn="1" w:firstRow="1" w:lastColumn="0" w:lastRow="0" w:noHBand="0" w:noVBand="1" w:val="04A0"/>
+      </w:tblPr>
+      <w:tblGrid>
+        <w:gridCol w:w="9360"/>
+      </w:tblGrid>
+      <w:tr>
+        <w:tc>
+          <w:tcPr>
+            <w:tcW w:type="dxa" w:w="9360"/>
+            <w:shd w:val="clear" w:color="auto" w:fill="F1F5F9"/>
+          </w:tcPr>
+          <w:p>
+            <w:pPr>
+              <w:spacing w:before="120" w:after="120"/>
+              <w:ind w:left="144" w:right="144"/>
+            </w:pPr>
+            <w:r>
+              <w:rPr>
+                <w:rFonts w:ascii="Consolas" w:hAnsi="Consolas"/>
+                <w:color w:val="0F172A"/>
+                <w:sz w:val="18"/>
+              </w:rPr>
+              <w:t>.env</w:t>
+              <w:br/>
+              <w:t>__pycache__/</w:t>
+              <w:br/>
+              <w:t>*.pyc</w:t>
+              <w:br/>
+              <w:t>*.pyo</w:t>
+              <w:br/>
+              <w:t>feedback_log.csv</w:t>
+              <w:br/>
+              <w:t>.venv/</w:t>
+              <w:br/>
+              <w:t>venv/</w:t>
+              <w:br/>
+              <w:t>env/</w:t>
+              <w:br/>
             </w:r>
           </w:p>
         </w:tc>

</xml_diff>

<commit_message>
Update technical report with pipeline flowchart, detailed code descriptions, and PDF export
</commit_message>
<xml_diff>
--- a/AI_Assistant_Technical_Report.docx
+++ b/AI_Assistant_Technical_Report.docx
@@ -262,6 +262,89 @@
     <w:p>
       <w:pPr>
         <w:keepNext/>
+        <w:spacing w:before="240" w:after="120"/>
+      </w:pPr>
+      <w:r>
+        <w:rPr>
+          <w:rFonts w:ascii="Trebuchet MS" w:hAnsi="Trebuchet MS"/>
+          <w:b/>
+          <w:color w:val="0F172A"/>
+          <w:sz w:val="28"/>
+        </w:rPr>
+        <w:t>2.3 System Pipeline Flowchart</w:t>
+      </w:r>
+    </w:p>
+    <w:p>
+      <w:pPr>
+        <w:spacing w:after="160" w:line="276" w:lineRule="auto"/>
+      </w:pPr>
+      <w:r>
+        <w:rPr>
+          <w:rFonts w:ascii="Calibri" w:hAnsi="Calibri"/>
+          <w:color w:val="334155"/>
+          <w:sz w:val="22"/>
+        </w:rPr>
+        <w:t>The diagram below details the end-to-end data lifecycle, from initial UI user selection inputs, through Flask server route handler transformations and NVIDIA NIM Llama-3.1 LLM request formatting, to the thread-locked CSV metrics logger:</w:t>
+      </w:r>
+    </w:p>
+    <w:p>
+      <w:pPr>
+        <w:spacing w:before="240" w:after="80"/>
+        <w:jc w:val="center"/>
+      </w:pPr>
+      <w:r>
+        <w:drawing>
+          <wp:inline xmlns:a="http://schemas.openxmlformats.org/drawingml/2006/main" xmlns:pic="http://schemas.openxmlformats.org/drawingml/2006/picture">
+            <wp:extent cx="5486400" cy="3840480"/>
+            <wp:docPr id="1" name="Picture 1"/>
+            <wp:cNvGraphicFramePr>
+              <a:graphicFrameLocks noChangeAspect="1"/>
+            </wp:cNvGraphicFramePr>
+            <a:graphic>
+              <a:graphicData uri="http://schemas.openxmlformats.org/drawingml/2006/picture">
+                <pic:pic>
+                  <pic:nvPicPr>
+                    <pic:cNvPr id="0" name="flowchart.png"/>
+                    <pic:cNvPicPr/>
+                  </pic:nvPicPr>
+                  <pic:blipFill>
+                    <a:blip r:embed="rId9"/>
+                    <a:stretch>
+                      <a:fillRect/>
+                    </a:stretch>
+                  </pic:blipFill>
+                  <pic:spPr>
+                    <a:xfrm>
+                      <a:off x="0" y="0"/>
+                      <a:ext cx="5486400" cy="3840480"/>
+                    </a:xfrm>
+                    <a:prstGeom prst="rect"/>
+                  </pic:spPr>
+                </pic:pic>
+              </a:graphicData>
+            </a:graphic>
+          </wp:inline>
+        </w:drawing>
+      </w:r>
+    </w:p>
+    <w:p>
+      <w:pPr>
+        <w:spacing w:after="240"/>
+        <w:jc w:val="center"/>
+      </w:pPr>
+      <w:r>
+        <w:rPr>
+          <w:rFonts w:ascii="Calibri" w:hAnsi="Calibri"/>
+          <w:i/>
+          <w:color w:val="64748B"/>
+          <w:sz w:val="19"/>
+        </w:rPr>
+        <w:t>Figure: System Pipeline Flowchart detailing the request-response lifecycle.</w:t>
+      </w:r>
+    </w:p>
+    <w:p>
+      <w:pPr>
+        <w:keepNext/>
         <w:spacing w:before="360" w:after="160"/>
       </w:pPr>
       <w:r>
@@ -324,7 +407,7 @@
         <w:drawing>
           <wp:inline xmlns:a="http://schemas.openxmlformats.org/drawingml/2006/main" xmlns:pic="http://schemas.openxmlformats.org/drawingml/2006/picture">
             <wp:extent cx="5486400" cy="3070307"/>
-            <wp:docPr id="1" name="Picture 1"/>
+            <wp:docPr id="2" name="Picture 2"/>
             <wp:cNvGraphicFramePr>
               <a:graphicFrameLocks noChangeAspect="1"/>
             </wp:cNvGraphicFramePr>
@@ -336,7 +419,7 @@
                     <pic:cNvPicPr/>
                   </pic:nvPicPr>
                   <pic:blipFill>
-                    <a:blip r:embed="rId9"/>
+                    <a:blip r:embed="rId10"/>
                     <a:stretch>
                       <a:fillRect/>
                     </a:stretch>
@@ -407,7 +490,7 @@
         <w:drawing>
           <wp:inline xmlns:a="http://schemas.openxmlformats.org/drawingml/2006/main" xmlns:pic="http://schemas.openxmlformats.org/drawingml/2006/picture">
             <wp:extent cx="5486400" cy="3070307"/>
-            <wp:docPr id="2" name="Picture 2"/>
+            <wp:docPr id="3" name="Picture 3"/>
             <wp:cNvGraphicFramePr>
               <a:graphicFrameLocks noChangeAspect="1"/>
             </wp:cNvGraphicFramePr>
@@ -419,7 +502,7 @@
                     <pic:cNvPicPr/>
                   </pic:nvPicPr>
                   <pic:blipFill>
-                    <a:blip r:embed="rId10"/>
+                    <a:blip r:embed="rId11"/>
                     <a:stretch>
                       <a:fillRect/>
                     </a:stretch>
@@ -465,7 +548,7 @@
           <w:color w:val="4F46E5"/>
           <w:sz w:val="36"/>
         </w:rPr>
-        <w:t>4. Complete Source Code Documentation</w:t>
+        <w:t>4. Complete Source Code &amp; Implementation Details</w:t>
       </w:r>
     </w:p>
     <w:p>
@@ -481,6 +564,34 @@
           <w:sz w:val="28"/>
         </w:rPr>
         <w:t>4.1 Flask Server Routing (app.py)</w:t>
+      </w:r>
+    </w:p>
+    <w:p>
+      <w:pPr>
+        <w:spacing w:after="160" w:line="276" w:lineRule="auto"/>
+      </w:pPr>
+      <w:r>
+        <w:rPr>
+          <w:rFonts w:ascii="Calibri" w:hAnsi="Calibri"/>
+          <w:color w:val="334155"/>
+          <w:sz w:val="22"/>
+        </w:rPr>
+        <w:t>File Description:</w:t>
+        <w:br/>
+        <w:t>The app.py file serves as the main application controller. It imports requests to handle HTTPS payloads, csv to log ratings, and threading to lock the logger file during multi-user write scenarios. It declares the global PROMPTS, SYSTEM_PROMPTS, and labels, and connects user requests with the NVIDIA NIM chat completions model (meta/llama-3.1-8b-instruct) endpoints.</w:t>
+      </w:r>
+    </w:p>
+    <w:p>
+      <w:pPr>
+        <w:spacing w:after="160" w:line="276" w:lineRule="auto"/>
+      </w:pPr>
+      <w:r>
+        <w:rPr>
+          <w:rFonts w:ascii="Calibri" w:hAnsi="Calibri"/>
+          <w:color w:val="334155"/>
+          <w:sz w:val="22"/>
+        </w:rPr>
+        <w:t>Code Segment:</w:t>
       </w:r>
     </w:p>
     <w:tbl>
@@ -1026,6 +1137,21 @@
     </w:tbl>
     <w:p>
       <w:pPr>
+        <w:spacing w:after="160" w:line="276" w:lineRule="auto"/>
+      </w:pPr>
+      <w:r>
+        <w:rPr>
+          <w:rFonts w:ascii="Calibri" w:hAnsi="Calibri"/>
+          <w:color w:val="334155"/>
+          <w:sz w:val="22"/>
+        </w:rPr>
+        <w:t>Execution Details:</w:t>
+        <w:br/>
+        <w:t>Upon receipt of client POST requests on /generate, the helper function call_nvidia formats the template with user inputs, queries Llama-3.1-8b, and returns structured markdown payloads. Thumbs up/down feedback ratings call /feedback, appending them safely to the local CSV logger.</w:t>
+      </w:r>
+    </w:p>
+    <w:p>
+      <w:pPr>
         <w:keepNext/>
         <w:spacing w:before="240" w:after="120"/>
       </w:pPr>
@@ -1037,6 +1163,34 @@
           <w:sz w:val="28"/>
         </w:rPr>
         <w:t>4.2 Main HTML Workspace (templates/index.html)</w:t>
+      </w:r>
+    </w:p>
+    <w:p>
+      <w:pPr>
+        <w:spacing w:after="160" w:line="276" w:lineRule="auto"/>
+      </w:pPr>
+      <w:r>
+        <w:rPr>
+          <w:rFonts w:ascii="Calibri" w:hAnsi="Calibri"/>
+          <w:color w:val="334155"/>
+          <w:sz w:val="22"/>
+        </w:rPr>
+        <w:t>File Description:</w:t>
+        <w:br/>
+        <w:t>The index.html file provides the core workspace layout, styled in a flat light-corporate style using Tailwind CSS. It sets up tabs for selecting functions, displays prompt style selectors, includes a character-counted input textarea, and provides copying mechanisms and thumbs-up/down ratings for user response cards.</w:t>
+      </w:r>
+    </w:p>
+    <w:p>
+      <w:pPr>
+        <w:spacing w:after="160" w:line="276" w:lineRule="auto"/>
+      </w:pPr>
+      <w:r>
+        <w:rPr>
+          <w:rFonts w:ascii="Calibri" w:hAnsi="Calibri"/>
+          <w:color w:val="334155"/>
+          <w:sz w:val="22"/>
+        </w:rPr>
+        <w:t>Code Segment:</w:t>
       </w:r>
     </w:p>
     <w:tbl>
@@ -1839,6 +1993,21 @@
     </w:tbl>
     <w:p>
       <w:pPr>
+        <w:spacing w:after="160" w:line="276" w:lineRule="auto"/>
+      </w:pPr>
+      <w:r>
+        <w:rPr>
+          <w:rFonts w:ascii="Calibri" w:hAnsi="Calibri"/>
+          <w:color w:val="334155"/>
+          <w:sz w:val="22"/>
+        </w:rPr>
+        <w:t>Execution Details:</w:t>
+        <w:br/>
+        <w:t>All forms use event.preventDefault() and fetch() calls. When a user changes a tab, selectFunction() updates dropdown options and descriptions. Responses are rendered on the page using a lightweight custom markdown parsing helper.</w:t>
+      </w:r>
+    </w:p>
+    <w:p>
+      <w:pPr>
         <w:keepNext/>
         <w:spacing w:before="240" w:after="120"/>
       </w:pPr>
@@ -1850,6 +2019,34 @@
           <w:sz w:val="28"/>
         </w:rPr>
         <w:t>4.3 Analytics HTML template (templates/feedback_summary.html)</w:t>
+      </w:r>
+    </w:p>
+    <w:p>
+      <w:pPr>
+        <w:spacing w:after="160" w:line="276" w:lineRule="auto"/>
+      </w:pPr>
+      <w:r>
+        <w:rPr>
+          <w:rFonts w:ascii="Calibri" w:hAnsi="Calibri"/>
+          <w:color w:val="334155"/>
+          <w:sz w:val="22"/>
+        </w:rPr>
+        <w:t>File Description:</w:t>
+        <w:br/>
+        <w:t>The feedback_summary.html file provides the analytics dashboard layout. It displays cards for total interactions, helpful scores, dissatisfaction totals, satisfaction rates, and renders progress bars and per-style breakdown tables.</w:t>
+      </w:r>
+    </w:p>
+    <w:p>
+      <w:pPr>
+        <w:spacing w:after="160" w:line="276" w:lineRule="auto"/>
+      </w:pPr>
+      <w:r>
+        <w:rPr>
+          <w:rFonts w:ascii="Calibri" w:hAnsi="Calibri"/>
+          <w:color w:val="334155"/>
+          <w:sz w:val="22"/>
+        </w:rPr>
+        <w:t>Code Segment:</w:t>
       </w:r>
     </w:p>
     <w:tbl>
@@ -2209,6 +2406,21 @@
     </w:tbl>
     <w:p>
       <w:pPr>
+        <w:spacing w:after="160" w:line="276" w:lineRule="auto"/>
+      </w:pPr>
+      <w:r>
+        <w:rPr>
+          <w:rFonts w:ascii="Calibri" w:hAnsi="Calibri"/>
+          <w:color w:val="334155"/>
+          <w:sz w:val="22"/>
+        </w:rPr>
+        <w:t>Execution Details:</w:t>
+        <w:br/>
+        <w:t>The file utilizes Jinja2 syntax to iterate over the statistics aggregates calculated by the app.py helper get_feedback_stats(). It provides a clear overview of prompt helpfulness, letting users refine system prompts based on empirical metrics.</w:t>
+      </w:r>
+    </w:p>
+    <w:p>
+      <w:pPr>
         <w:keepNext/>
         <w:spacing w:before="240" w:after="120"/>
       </w:pPr>
@@ -2220,6 +2432,34 @@
           <w:sz w:val="28"/>
         </w:rPr>
         <w:t>4.4 Setup Requirements (requirements.txt)</w:t>
+      </w:r>
+    </w:p>
+    <w:p>
+      <w:pPr>
+        <w:spacing w:after="160" w:line="276" w:lineRule="auto"/>
+      </w:pPr>
+      <w:r>
+        <w:rPr>
+          <w:rFonts w:ascii="Calibri" w:hAnsi="Calibri"/>
+          <w:color w:val="334155"/>
+          <w:sz w:val="22"/>
+        </w:rPr>
+        <w:t>File Description:</w:t>
+        <w:br/>
+        <w:t>Declares python libraries necessary to run the web application server locally. Uses flask for routing, requests to call the NIM endpoint, and python-dotenv to isolate api keys from source control repositories.</w:t>
+      </w:r>
+    </w:p>
+    <w:p>
+      <w:pPr>
+        <w:spacing w:after="160" w:line="276" w:lineRule="auto"/>
+      </w:pPr>
+      <w:r>
+        <w:rPr>
+          <w:rFonts w:ascii="Calibri" w:hAnsi="Calibri"/>
+          <w:color w:val="334155"/>
+          <w:sz w:val="22"/>
+        </w:rPr>
+        <w:t>Code Segment:</w:t>
       </w:r>
     </w:p>
     <w:tbl>
@@ -2273,6 +2513,34 @@
           <w:sz w:val="28"/>
         </w:rPr>
         <w:t>4.5 Git Exclusions (.gitignore)</w:t>
+      </w:r>
+    </w:p>
+    <w:p>
+      <w:pPr>
+        <w:spacing w:after="160" w:line="276" w:lineRule="auto"/>
+      </w:pPr>
+      <w:r>
+        <w:rPr>
+          <w:rFonts w:ascii="Calibri" w:hAnsi="Calibri"/>
+          <w:color w:val="334155"/>
+          <w:sz w:val="22"/>
+        </w:rPr>
+        <w:t>File Description:</w:t>
+        <w:br/>
+        <w:t>Excludes python cache objects, virtual environments (.venv), user feedback logs, and sensitive credential variables (.env) from remote repositories.</w:t>
+      </w:r>
+    </w:p>
+    <w:p>
+      <w:pPr>
+        <w:spacing w:after="160" w:line="276" w:lineRule="auto"/>
+      </w:pPr>
+      <w:r>
+        <w:rPr>
+          <w:rFonts w:ascii="Calibri" w:hAnsi="Calibri"/>
+          <w:color w:val="334155"/>
+          <w:sz w:val="22"/>
+        </w:rPr>
+        <w:t>Code Segment:</w:t>
       </w:r>
     </w:p>
     <w:tbl>

</xml_diff>